<commit_message>
Answer self-review: Transformer, significance, cross-model results in paper
- Transformer baseline on all corpora; paired vehicle-bootstrap significance
- Additional Validation subsection (cross-model, window, hyperparameters,
  operating points, Transformer); detection table includes Transformer
- Supplementary Material (15 sections) regenerated from results
- Response-to-reviewers template filled with verified numbers
- Word versions of manuscript, supplementary, cover letter, response, guides
</commit_message>
<xml_diff>
--- a/paper/word/Cover_Letter.docx
+++ b/paper/word/Cover_Letter.docx
@@ -438,7 +438,7 @@
         <w:t xml:space="preserve"> </w:t>
       </w:r>
       <w:r>
-        <w:t xml:space="preserve">ten baseline and ablation models. On unseen vehicles a full-bus tool</w:t>
+        <w:t xml:space="preserve">eleven baseline and ablation models. On unseen vehicles a full-bus tool</w:t>
       </w:r>
       <w:r>
         <w:t xml:space="preserve"> </w:t>
@@ -482,7 +482,19 @@
         <w:t xml:space="preserve"> </w:t>
       </w:r>
       <w:r>
-        <w:t xml:space="preserve">constants of the model are stress-tested by deliberate mis-specification,</w:t>
+        <w:t xml:space="preserve">constants of the model are stress-tested by deliberate mis-specification</w:t>
+      </w:r>
+      <w:r>
+        <w:t xml:space="preserve"> </w:t>
+      </w:r>
+      <w:r>
+        <w:t xml:space="preserve">and by a structurally different fault process (on which a full-bus tool</w:t>
+      </w:r>
+      <w:r>
+        <w:t xml:space="preserve"> </w:t>
+      </w:r>
+      <w:r>
+        <w:t xml:space="preserve">still reaches AUROC 0.856),</w:t>
       </w:r>
       <w:r>
         <w:t xml:space="preserve"> </w:t>
@@ -500,13 +512,25 @@
         <w:t xml:space="preserve"> </w:t>
       </w:r>
       <w:r>
-        <w:t xml:space="preserve">All code is publicly available, and every reported number can be</w:t>
-      </w:r>
-      <w:r>
-        <w:t xml:space="preserve"> </w:t>
-      </w:r>
-      <w:r>
-        <w:t xml:space="preserve">reproduced from it.</w:t>
+        <w:t xml:space="preserve">A Supplementary Material document reports the complete results, paired</w:t>
+      </w:r>
+      <w:r>
+        <w:t xml:space="preserve"> </w:t>
+      </w:r>
+      <w:r>
+        <w:t xml:space="preserve">significance tests against every baseline, hyperparameter and window-length</w:t>
+      </w:r>
+      <w:r>
+        <w:t xml:space="preserve"> </w:t>
+      </w:r>
+      <w:r>
+        <w:t xml:space="preserve">sensitivity, and false-alarm rates per hour of real driving. All code is</w:t>
+      </w:r>
+      <w:r>
+        <w:t xml:space="preserve"> </w:t>
+      </w:r>
+      <w:r>
+        <w:t xml:space="preserve">available, and every reported number can be reproduced from it.</w:t>
       </w:r>
     </w:p>
     <w:p>

</xml_diff>